<commit_message>
Refined close button option
</commit_message>
<xml_diff>
--- a/backend/controllers/output_2.docx
+++ b/backend/controllers/output_2.docx
@@ -658,7 +658,440 @@
                 <w:sz w:val="24"/>
                 <w:szCs w:val="24"/>
               </w:rPr>
-              <w:t xml:space="preserve">What is lifeee?</w:t>
+              <w:t xml:space="preserve">What is MCQ?</w:t>
+            </w:r>
+          </w:p>
+        </w:tc>
+        <w:tc>
+          <w:tcPr>
+            <w:tcW w:w="2153" w:type="dxa"/>
+            <w:tcBorders>
+              <w:top w:val="nil"/>
+              <w:bottom w:val="nil"/>
+            </w:tcBorders>
+            <w:shd w:val="clear" w:color="auto" w:fill="auto"/>
+          </w:tcPr>
+          <w:p>
+            <w:pPr>
+              <w:spacing w:after="0" w:line="240" w:lineRule="auto"/>
+              <w:rPr>
+                <w:rFonts w:ascii="Times New Roman" w:hAnsi="Times New Roman"/>
+                <w:sz w:val="24"/>
+                <w:szCs w:val="24"/>
+              </w:rPr>
+            </w:pPr>
+            <w:r>
+              <w:rPr>
+                <w:rFonts w:ascii="Times New Roman" w:hAnsi="Times New Roman"/>
+                <w:b/>
+                <w:bCs/>
+                <w:sz w:val="24"/>
+                <w:szCs w:val="24"/>
+              </w:rPr>
+              <w:t xml:space="preserve">CO1</w:t>
+            </w:r>
+            <w:proofErr w:type="spellStart"/>
+            <w:r>
+              <w:rPr>
+                <w:rFonts w:ascii="Times New Roman" w:hAnsi="Times New Roman"/>
+                <w:b/>
+                <w:bCs/>
+                <w:sz w:val="24"/>
+                <w:szCs w:val="24"/>
+              </w:rPr>
+              <w:t/>
+            </w:r>
+            <w:proofErr w:type="spellEnd"/>
+            <w:r>
+              <w:rPr>
+                <w:rFonts w:ascii="Times New Roman" w:hAnsi="Times New Roman"/>
+                <w:b/>
+                <w:bCs/>
+                <w:sz w:val="24"/>
+                <w:szCs w:val="24"/>
+              </w:rPr>
+              <w:t/>
+            </w:r>
+          </w:p>
+        </w:tc>
+        <w:tc>
+          <w:tcPr>
+            <w:tcW w:w="1787" w:type="dxa"/>
+            <w:tcBorders>
+              <w:top w:val="nil"/>
+              <w:bottom w:val="nil"/>
+            </w:tcBorders>
+            <w:shd w:val="clear" w:color="auto" w:fill="auto"/>
+          </w:tcPr>
+          <w:p>
+            <w:pPr>
+              <w:spacing w:after="0" w:line="240" w:lineRule="auto"/>
+              <w:rPr>
+                <w:rFonts w:ascii="Times New Roman" w:hAnsi="Times New Roman"/>
+                <w:b/>
+                <w:bCs/>
+                <w:sz w:val="24"/>
+                <w:szCs w:val="24"/>
+              </w:rPr>
+            </w:pPr>
+            <w:r>
+              <w:rPr>
+                <w:rFonts w:ascii="Times New Roman" w:hAnsi="Times New Roman"/>
+                <w:b/>
+                <w:bCs/>
+                <w:sz w:val="24"/>
+                <w:szCs w:val="24"/>
+              </w:rPr>
+              <w:t xml:space="preserve">L1</w:t>
+            </w:r>
+            <w:proofErr w:type="spellStart"/>
+            <w:r>
+              <w:rPr>
+                <w:rFonts w:ascii="Times New Roman" w:hAnsi="Times New Roman"/>
+                <w:b/>
+                <w:bCs/>
+                <w:sz w:val="24"/>
+                <w:szCs w:val="24"/>
+              </w:rPr>
+              <w:t/>
+            </w:r>
+            <w:proofErr w:type="spellEnd"/>
+            <w:r>
+              <w:rPr>
+                <w:rFonts w:ascii="Times New Roman" w:hAnsi="Times New Roman"/>
+                <w:b/>
+                <w:bCs/>
+                <w:sz w:val="24"/>
+                <w:szCs w:val="24"/>
+              </w:rPr>
+              <w:t/>
+            </w:r>
+          </w:p>
+        </w:tc>
+        <w:tc>
+          <w:tcPr>
+            <w:tcW w:w="2155" w:type="dxa"/>
+            <w:tcBorders>
+              <w:top w:val="nil"/>
+              <w:bottom w:val="nil"/>
+            </w:tcBorders>
+            <w:shd w:val="clear" w:color="auto" w:fill="auto"/>
+          </w:tcPr>
+          <w:p>
+            <w:pPr>
+              <w:spacing w:after="0" w:line="240" w:lineRule="auto"/>
+              <w:rPr>
+                <w:rFonts w:ascii="Times New Roman" w:hAnsi="Times New Roman"/>
+                <w:sz w:val="24"/>
+                <w:szCs w:val="24"/>
+              </w:rPr>
+            </w:pPr>
+            <w:r>
+              <w:rPr>
+                <w:rFonts w:ascii="Times New Roman" w:hAnsi="Times New Roman"/>
+                <w:sz w:val="24"/>
+                <w:szCs w:val="24"/>
+              </w:rPr>
+              <w:t xml:space="preserve">        </w:t>
+            </w:r>
+            <w:r>
+              <w:rPr>
+                <w:rFonts w:ascii="Times New Roman" w:hAnsi="Times New Roman"/>
+                <w:b/>
+                <w:bCs/>
+                <w:sz w:val="24"/>
+                <w:szCs w:val="24"/>
+              </w:rPr>
+              <w:t xml:space="preserve">5</w:t>
+            </w:r>
+          </w:p>
+        </w:tc>
+      </w:tr>
+      <w:tr>
+        <w:trPr>
+          <w:trHeight w:val="80"/>
+        </w:trPr>
+        <w:tc>
+          <w:tcPr>
+            <w:tcW w:w="1137" w:type="dxa"/>
+            <w:tcBorders>
+              <w:top w:val="nil"/>
+            </w:tcBorders>
+            <w:shd w:val="clear" w:color="auto" w:fill="auto"/>
+          </w:tcPr>
+          <w:p>
+            <w:pPr>
+              <w:spacing w:after="0" w:line="240" w:lineRule="auto"/>
+              <w:rPr>
+                <w:rFonts w:ascii="Times New Roman" w:hAnsi="Times New Roman"/>
+                <w:sz w:val="24"/>
+                <w:szCs w:val="24"/>
+              </w:rPr>
+            </w:pPr>
+            <w:r>
+              <w:rPr>
+                <w:rFonts w:ascii="Times New Roman" w:hAnsi="Times New Roman"/>
+                <w:sz w:val="24"/>
+                <w:szCs w:val="24"/>
+              </w:rPr>
+              <w:t/>
+            </w:r>
+          </w:p>
+        </w:tc>
+        <w:tc>
+          <w:tcPr>
+            <w:tcW w:w="5718" w:type="dxa"/>
+            <w:tcBorders>
+              <w:top w:val="nil"/>
+            </w:tcBorders>
+            <w:shd w:val="clear" w:color="auto" w:fill="auto"/>
+          </w:tcPr>
+          <w:p>
+            <w:pPr>
+              <w:spacing w:after="0" w:line="240" w:lineRule="auto"/>
+              <w:jc w:val="right"/>
+              <w:rPr>
+                <w:rFonts w:ascii="Times New Roman" w:hAnsi="Times New Roman"/>
+                <w:sz w:val="24"/>
+                <w:szCs w:val="24"/>
+              </w:rPr>
+            </w:pPr>
+          </w:p>
+        </w:tc>
+        <w:tc>
+          <w:tcPr>
+            <w:tcW w:w="2153" w:type="dxa"/>
+            <w:tcBorders>
+              <w:top w:val="nil"/>
+            </w:tcBorders>
+            <w:shd w:val="clear" w:color="auto" w:fill="auto"/>
+          </w:tcPr>
+          <w:p>
+            <w:pPr>
+              <w:spacing w:after="0" w:line="240" w:lineRule="auto"/>
+              <w:rPr>
+                <w:rFonts w:ascii="Times New Roman" w:hAnsi="Times New Roman"/>
+                <w:sz w:val="24"/>
+                <w:szCs w:val="24"/>
+              </w:rPr>
+            </w:pPr>
+          </w:p>
+        </w:tc>
+        <w:tc>
+          <w:tcPr>
+            <w:tcW w:w="1787" w:type="dxa"/>
+            <w:tcBorders>
+              <w:top w:val="nil"/>
+            </w:tcBorders>
+            <w:shd w:val="clear" w:color="auto" w:fill="auto"/>
+          </w:tcPr>
+          <w:p>
+            <w:pPr>
+              <w:spacing w:after="0" w:line="240" w:lineRule="auto"/>
+              <w:rPr>
+                <w:rFonts w:ascii="Times New Roman" w:hAnsi="Times New Roman"/>
+                <w:sz w:val="24"/>
+                <w:szCs w:val="24"/>
+              </w:rPr>
+            </w:pPr>
+          </w:p>
+        </w:tc>
+        <w:tc>
+          <w:tcPr>
+            <w:tcW w:w="2155" w:type="dxa"/>
+            <w:tcBorders>
+              <w:top w:val="nil"/>
+            </w:tcBorders>
+            <w:shd w:val="clear" w:color="auto" w:fill="auto"/>
+          </w:tcPr>
+          <w:p>
+            <w:pPr>
+              <w:spacing w:after="0" w:line="240" w:lineRule="auto"/>
+              <w:rPr>
+                <w:rFonts w:ascii="Times New Roman" w:hAnsi="Times New Roman"/>
+                <w:sz w:val="24"/>
+                <w:szCs w:val="24"/>
+              </w:rPr>
+            </w:pPr>
+          </w:p>
+        </w:tc>
+      </w:tr>
+      <w:tr>
+        <w:trPr>
+          <w:trHeight w:val="223"/>
+        </w:trPr>
+        <w:tc>
+          <w:tcPr>
+            <w:tcW w:w="1137" w:type="dxa"/>
+            <w:tcBorders>
+              <w:bottom w:val="nil"/>
+            </w:tcBorders>
+            <w:shd w:val="clear" w:color="auto" w:fill="auto"/>
+          </w:tcPr>
+          <w:p>
+            <w:pPr>
+              <w:spacing w:after="0" w:line="240" w:lineRule="auto"/>
+              <w:rPr>
+                <w:rFonts w:ascii="Times New Roman" w:hAnsi="Times New Roman"/>
+                <w:sz w:val="24"/>
+                <w:szCs w:val="24"/>
+              </w:rPr>
+            </w:pPr>
+            <w:r>
+              <w:rPr>
+                <w:rFonts w:ascii="Times New Roman" w:hAnsi="Times New Roman"/>
+                <w:sz w:val="24"/>
+                <w:szCs w:val="24"/>
+              </w:rPr>
+              <w:t/>
+            </w:r>
+          </w:p>
+        </w:tc>
+        <w:tc>
+          <w:tcPr>
+            <w:tcW w:w="5718" w:type="dxa"/>
+            <w:tcBorders>
+              <w:bottom w:val="nil"/>
+            </w:tcBorders>
+            <w:shd w:val="clear" w:color="auto" w:fill="auto"/>
+          </w:tcPr>
+          <w:p>
+            <w:pPr>
+              <w:spacing w:after="0" w:line="240" w:lineRule="auto"/>
+              <w:jc w:val="right"/>
+              <w:rPr>
+                <w:rFonts w:ascii="Times New Roman" w:hAnsi="Times New Roman"/>
+                <w:sz w:val="24"/>
+                <w:szCs w:val="24"/>
+              </w:rPr>
+            </w:pPr>
+          </w:p>
+        </w:tc>
+        <w:tc>
+          <w:tcPr>
+            <w:tcW w:w="2153" w:type="dxa"/>
+            <w:tcBorders>
+              <w:bottom w:val="nil"/>
+            </w:tcBorders>
+            <w:shd w:val="clear" w:color="auto" w:fill="auto"/>
+          </w:tcPr>
+          <w:p>
+            <w:pPr>
+              <w:spacing w:after="0" w:line="240" w:lineRule="auto"/>
+              <w:rPr>
+                <w:rFonts w:ascii="Times New Roman" w:hAnsi="Times New Roman"/>
+                <w:sz w:val="24"/>
+                <w:szCs w:val="24"/>
+              </w:rPr>
+            </w:pPr>
+          </w:p>
+        </w:tc>
+        <w:tc>
+          <w:tcPr>
+            <w:tcW w:w="1787" w:type="dxa"/>
+            <w:tcBorders>
+              <w:bottom w:val="nil"/>
+            </w:tcBorders>
+            <w:shd w:val="clear" w:color="auto" w:fill="auto"/>
+          </w:tcPr>
+          <w:p>
+            <w:pPr>
+              <w:spacing w:after="0" w:line="240" w:lineRule="auto"/>
+              <w:rPr>
+                <w:rFonts w:ascii="Times New Roman" w:hAnsi="Times New Roman"/>
+                <w:sz w:val="24"/>
+                <w:szCs w:val="24"/>
+              </w:rPr>
+            </w:pPr>
+          </w:p>
+        </w:tc>
+        <w:tc>
+          <w:tcPr>
+            <w:tcW w:w="2155" w:type="dxa"/>
+            <w:tcBorders>
+              <w:bottom w:val="nil"/>
+            </w:tcBorders>
+            <w:shd w:val="clear" w:color="auto" w:fill="auto"/>
+          </w:tcPr>
+          <w:p>
+            <w:pPr>
+              <w:spacing w:after="0" w:line="240" w:lineRule="auto"/>
+              <w:rPr>
+                <w:rFonts w:ascii="Times New Roman" w:hAnsi="Times New Roman"/>
+                <w:sz w:val="24"/>
+                <w:szCs w:val="24"/>
+              </w:rPr>
+            </w:pPr>
+          </w:p>
+        </w:tc>
+      </w:tr>
+      <w:tr>
+        <w:trPr>
+          <w:trHeight w:val="272"/>
+        </w:trPr>
+        <w:tc>
+          <w:tcPr>
+            <w:tcW w:w="1137" w:type="dxa"/>
+            <w:tcBorders>
+              <w:top w:val="nil"/>
+              <w:bottom w:val="nil"/>
+            </w:tcBorders>
+            <w:shd w:val="clear" w:color="auto" w:fill="auto"/>
+          </w:tcPr>
+          <w:p>
+            <w:pPr>
+              <w:spacing w:after="0" w:line="240" w:lineRule="auto"/>
+              <w:rPr>
+                <w:rFonts w:ascii="Times New Roman" w:hAnsi="Times New Roman"/>
+                <w:b/>
+                <w:bCs/>
+                <w:sz w:val="24"/>
+                <w:szCs w:val="24"/>
+              </w:rPr>
+            </w:pPr>
+            <w:r>
+              <w:rPr>
+                <w:rFonts w:ascii="Times New Roman" w:hAnsi="Times New Roman"/>
+                <w:b/>
+                <w:bCs/>
+                <w:sz w:val="24"/>
+                <w:szCs w:val="24"/>
+              </w:rPr>
+              <w:t xml:space="preserve">2</w:t>
+            </w:r>
+          </w:p>
+        </w:tc>
+        <w:tc>
+          <w:tcPr>
+            <w:tcW w:w="5718" w:type="dxa"/>
+            <w:tcBorders>
+              <w:top w:val="nil"/>
+              <w:bottom w:val="nil"/>
+            </w:tcBorders>
+            <w:shd w:val="clear" w:color="auto" w:fill="auto"/>
+          </w:tcPr>
+          <w:p>
+            <w:pPr>
+              <w:spacing w:after="0" w:line="240" w:lineRule="auto"/>
+              <w:jc w:val="both"/>
+              <w:rPr>
+                <w:rFonts w:ascii="Times New Roman" w:hAnsi="Times New Roman"/>
+                <w:b/>
+                <w:bCs/>
+                <w:sz w:val="24"/>
+                <w:szCs w:val="24"/>
+              </w:rPr>
+            </w:pPr>
+            <w:r>
+              <w:rPr>
+                <w:rStyle w:val="markedcontent"/>
+                <w:rFonts w:ascii="Times New Roman" w:hAnsi="Times New Roman"/>
+                <w:b/>
+                <w:bCs/>
+                <w:sz w:val="24"/>
+                <w:szCs w:val="24"/>
+              </w:rPr>
+              <w:t xml:space="preserve">What is Subjective?</w:t>
             </w:r>
           </w:p>
         </w:tc>

</xml_diff>